<commit_message>
Troca a licença MIT pela GNU GPL v3 e regera os PDFs das entregas
O planejamento prometia MIT, mas o arquivo LICENSE nunca tinha entrado no repositório. Entra agora com a GPL v3, e a troca chega a todo lugar que citava a MIT: os roteiros em Markdown e Word, os dois Canvas, o LEIA-ME de docs/projeto, o README, o cabeçalho do case em OpenSCAD e as instruções em .agents.

Os PDFs do Roteiro 1 e do Canvas v1 foram gerados de novo a partir do Word; a única diferença de texto em relação aos anteriores é a licença. O Canvas v2, apresentado em 16/09, entra pela primeira vez com Word e PDF.
</commit_message>
<xml_diff>
--- a/docs/projeto/01-entregas/docx/Roteiro_1-Diagnostico-e-Teorizacao_v1.docx
+++ b/docs/projeto/01-entregas/docx/Roteiro_1-Diagnostico-e-Teorizacao_v1.docx
@@ -352,7 +352,7 @@
         <w:rPr>
           <w:sz w:val="24"/>
         </w:rPr>
-        <w:t>Pretendemos publicar o código e a documentação sob licença MIT. A oficina permitirá observar se uma pessoa de fora do grupo consegue seguir as instruções e em quais etapas precisa de ajuda. A necessidade de apoio técnico será um dos resultados dessa avaliação.</w:t>
+        <w:t>Pretendemos publicar o código e a documentação sob licença GNU GPL v3. A oficina permitirá observar se uma pessoa de fora do grupo consegue seguir as instruções e em quais etapas precisa de ajuda. A necessidade de apoio técnico será um dos resultados dessa avaliação.</w:t>
       </w:r>
     </w:p>
     <w:p>
@@ -385,7 +385,7 @@
         <w:rPr>
           <w:sz w:val="24"/>
         </w:rPr>
-        <w:t>2. Publicar o hardware e o firmware como projeto aberto, sob licença MIT, com lista de materiais e instruções de montagem e configuração, avaliando sua compreensão por uma pessoa de fora do grupo.</w:t>
+        <w:t>2. Publicar o hardware e o firmware como projeto aberto, sob licença GNU GPL v3, com lista de materiais e instruções de montagem e configuração, avaliando sua compreensão por uma pessoa de fora do grupo.</w:t>
       </w:r>
     </w:p>
     <w:p>

</xml_diff>